<commit_message>
Menu page added and homepage updates
</commit_message>
<xml_diff>
--- a/docs/02_Website_Strategy.docx
+++ b/docs/02_Website_Strategy.docx
@@ -2438,7 +2438,7 @@
       </w:pPr>
       <w:sdt>
         <w:sdtPr>
-          <w:id w:val="-516506786"/>
+          <w:id w:val="-1135577784"/>
           <w:tag w:val="goog_rdk_0"/>
         </w:sdtPr>
         <w:sdtContent>
@@ -2465,7 +2465,7 @@
       </w:r>
       <w:sdt>
         <w:sdtPr>
-          <w:id w:val="440844163"/>
+          <w:id w:val="-1175195236"/>
           <w:tag w:val="goog_rdk_1"/>
         </w:sdtPr>
         <w:sdtContent>
@@ -2562,7 +2562,7 @@
       </w:pPr>
       <w:sdt>
         <w:sdtPr>
-          <w:id w:val="1151366652"/>
+          <w:id w:val="1609067401"/>
           <w:tag w:val="goog_rdk_2"/>
         </w:sdtPr>
         <w:sdtContent>
@@ -2667,7 +2667,7 @@
       </w:pPr>
       <w:sdt>
         <w:sdtPr>
-          <w:id w:val="-731495383"/>
+          <w:id w:val="1132229464"/>
           <w:tag w:val="goog_rdk_3"/>
         </w:sdtPr>
         <w:sdtContent>
@@ -3239,7 +3239,7 @@
               <w:rPr>
                 <w:rtl w:val="0"/>
               </w:rPr>
-              <w:t xml:space="preserve">Appetizers</w:t>
+              <w:t xml:space="preserve">Gastroboxes</w:t>
             </w:r>
             <w:r>
               <w:rPr>
@@ -3734,7 +3734,7 @@
         <w:rPr>
           <w:rtl w:val="0"/>
         </w:rPr>
-        <w:t xml:space="preserve">Frozen Foods</w:t>
+        <w:t xml:space="preserve">Gastroboxes</w:t>
       </w:r>
     </w:p>
     <w:p>

</xml_diff>